<commit_message>
Updated research paper with revised analysis and results
</commit_message>
<xml_diff>
--- a/UHI_Kolkata_Research_Paper_ShrutiChatterjee.docx
+++ b/UHI_Kolkata_Research_Paper_ShrutiChatterjee.docx
@@ -106,21 +106,37 @@
           <w:rFonts w:cs="Times New Roman"/>
           <w:szCs w:val="24"/>
         </w:rPr>
-        <w:t>This study analyzes the temporal variation and intensity change of Urban Heat Islands (UHIs) in Kolkata over a decade, from 2015 to 2025, using satellite-derived Land Surface Temperature (LST) data. Landsat 8 (2015) and Landsat 9 (2025) thermal bands were processed in QGIS to derive LST and assess spatial patterns of surface temperature. A change detection analysis identified areas of significant warming across the city, with temperature increases of up to approximately 6°C observed in the central and eastern u</w:t>
+        <w:t>This study analyzes the temporal variation and intensity change of Urban Heat Islands (UHIs) in Kolkata over a decade, from 2015 to 2025, using satellite-derived Land Surface Temperature (LST) data. Landsat 8 (2015) and Landsat 9 (2025) thermal bands were processed in QGIS to derive LST and assess spatial patterns of surface temperature. A change detection analysis</w:t>
       </w:r>
       <w:r>
         <w:rPr>
           <w:rFonts w:cs="Times New Roman"/>
           <w:szCs w:val="24"/>
         </w:rPr>
-        <w:t>r</w:t>
+        <w:t xml:space="preserve"> was conducted </w:t>
+      </w:r>
+      <w:proofErr w:type="gramStart"/>
+      <w:r>
+        <w:rPr>
+          <w:rFonts w:cs="Times New Roman"/>
+          <w:szCs w:val="24"/>
+        </w:rPr>
+        <w:t>to  identify</w:t>
+      </w:r>
+      <w:proofErr w:type="gramEnd"/>
+      <w:r>
+        <w:rPr>
+          <w:rFonts w:cs="Times New Roman"/>
+          <w:szCs w:val="24"/>
+        </w:rPr>
+        <w:t xml:space="preserve"> </w:t>
       </w:r>
       <w:r>
         <w:rPr>
           <w:rFonts w:cs="Times New Roman"/>
           <w:szCs w:val="24"/>
         </w:rPr>
-        <w:t xml:space="preserve">ban sectors. Mean surface temperature rose by </w:t>
+        <w:t xml:space="preserve"> areas of significant warming across the city, with temperature increases of up to approximately 6°C observed in the central and eastern urban sectors. Mean surface temperature rose by </w:t>
       </w:r>
       <w:proofErr w:type="gramStart"/>
       <w:r>
@@ -136,21 +152,7 @@
           <w:rFonts w:cs="Times New Roman"/>
           <w:szCs w:val="24"/>
         </w:rPr>
-        <w:t xml:space="preserve"> and the area under high to very high UHI zones expanded by about 13.7%. These findings highlight the growing thermal stress associated with rapid urban expansion in Kolkata and underscore the need for su</w:t>
-      </w:r>
-      <w:r>
-        <w:rPr>
-          <w:rFonts w:cs="Times New Roman"/>
-          <w:szCs w:val="24"/>
-        </w:rPr>
-        <w:t>s</w:t>
-      </w:r>
-      <w:r>
-        <w:rPr>
-          <w:rFonts w:cs="Times New Roman"/>
-          <w:szCs w:val="24"/>
-        </w:rPr>
-        <w:t>tainable planning measures such as vegetation enhancement, cool roofing, and wetland preservation to mitigate future heat effects.</w:t>
+        <w:t xml:space="preserve"> and the area under high to very high UHI zones expanded by about 13.7%. These findings highlight the growing thermal stress associated with rapid urban expansion in Kolkata and underscore the need for sustainable planning measures such as vegetation enhancement, cool roofing, and wetland preservation to mitigate future heat effects.</w:t>
       </w:r>
     </w:p>
     <w:p>
@@ -769,13 +771,13 @@
         <w:tblLook w:val="04A0"/>
       </w:tblPr>
       <w:tblGrid>
-        <w:gridCol w:w="723"/>
+        <w:gridCol w:w="724"/>
         <w:gridCol w:w="1121"/>
         <w:gridCol w:w="928"/>
         <w:gridCol w:w="1230"/>
-        <w:gridCol w:w="1761"/>
-        <w:gridCol w:w="2152"/>
-        <w:gridCol w:w="1917"/>
+        <w:gridCol w:w="1764"/>
+        <w:gridCol w:w="2142"/>
+        <w:gridCol w:w="1923"/>
       </w:tblGrid>
       <w:tr>
         <w:trPr>
@@ -1126,25 +1128,7 @@
                 <w:sz w:val="24"/>
                 <w:szCs w:val="24"/>
               </w:rPr>
-              <w:t>30 (</w:t>
-            </w:r>
-            <w:proofErr w:type="spellStart"/>
-            <w:r>
-              <w:rPr>
-                <w:rFonts w:eastAsia="Times New Roman" w:cs="Times New Roman"/>
-                <w:sz w:val="24"/>
-                <w:szCs w:val="24"/>
-              </w:rPr>
-              <w:t>resampled</w:t>
-            </w:r>
-            <w:proofErr w:type="spellEnd"/>
-            <w:r>
-              <w:rPr>
-                <w:rFonts w:eastAsia="Times New Roman" w:cs="Times New Roman"/>
-                <w:sz w:val="24"/>
-                <w:szCs w:val="24"/>
-              </w:rPr>
-              <w:t>)</w:t>
+              <w:t xml:space="preserve">30 </w:t>
             </w:r>
           </w:p>
         </w:tc>
@@ -1320,25 +1304,7 @@
                 <w:sz w:val="24"/>
                 <w:szCs w:val="24"/>
               </w:rPr>
-              <w:t>30 (</w:t>
-            </w:r>
-            <w:proofErr w:type="spellStart"/>
-            <w:r>
-              <w:rPr>
-                <w:rFonts w:eastAsia="Times New Roman" w:cs="Times New Roman"/>
-                <w:sz w:val="24"/>
-                <w:szCs w:val="24"/>
-              </w:rPr>
-              <w:t>resampled</w:t>
-            </w:r>
-            <w:proofErr w:type="spellEnd"/>
-            <w:r>
-              <w:rPr>
-                <w:rFonts w:eastAsia="Times New Roman" w:cs="Times New Roman"/>
-                <w:sz w:val="24"/>
-                <w:szCs w:val="24"/>
-              </w:rPr>
-              <w:t>)</w:t>
+              <w:t xml:space="preserve">30 </w:t>
             </w:r>
           </w:p>
         </w:tc>
@@ -1383,7 +1349,15 @@
           <w:b/>
           <w:szCs w:val="24"/>
         </w:rPr>
-        <w:t>Table 1.</w:t>
+        <w:t xml:space="preserve">Table </w:t>
+      </w:r>
+      <w:r>
+        <w:rPr>
+          <w:rFonts w:cs="Times New Roman"/>
+          <w:b/>
+          <w:szCs w:val="24"/>
+        </w:rPr>
+        <w:t>.</w:t>
       </w:r>
       <w:proofErr w:type="gramEnd"/>
       <w:r>
@@ -1812,13 +1786,31 @@
           <w:szCs w:val="24"/>
         </w:rPr>
       </w:pPr>
+      <w:proofErr w:type="gramStart"/>
       <w:r>
         <w:rPr>
           <w:rFonts w:cs="Times New Roman"/>
           <w:b/>
           <w:szCs w:val="24"/>
         </w:rPr>
-        <w:t>Table 2: Showing land surface temperature (2015 and2025)</w:t>
+        <w:t xml:space="preserve">Table </w:t>
+      </w:r>
+      <w:r>
+        <w:rPr>
+          <w:rFonts w:cs="Times New Roman"/>
+          <w:b/>
+          <w:szCs w:val="24"/>
+        </w:rPr>
+        <w:t>:</w:t>
+      </w:r>
+      <w:proofErr w:type="gramEnd"/>
+      <w:r>
+        <w:rPr>
+          <w:rFonts w:cs="Times New Roman"/>
+          <w:b/>
+          <w:szCs w:val="24"/>
+        </w:rPr>
+        <w:t xml:space="preserve"> Showing land surface temperature (2015 and2025)</w:t>
       </w:r>
     </w:p>
     <w:tbl>
@@ -2628,7 +2620,15 @@
           <w:b/>
           <w:szCs w:val="24"/>
         </w:rPr>
-        <w:t>Table 3.</w:t>
+        <w:t xml:space="preserve">Table </w:t>
+      </w:r>
+      <w:r>
+        <w:rPr>
+          <w:rFonts w:cs="Times New Roman"/>
+          <w:b/>
+          <w:szCs w:val="24"/>
+        </w:rPr>
+        <w:t>.</w:t>
       </w:r>
       <w:proofErr w:type="gramEnd"/>
       <w:r>
@@ -3206,17 +3206,65 @@
           </w:p>
         </w:tc>
       </w:tr>
+      <w:tr>
+        <w:tc>
+          <w:tcPr>
+            <w:tcW w:w="0" w:type="auto"/>
+            <w:hideMark/>
+          </w:tcPr>
+          <w:p>
+            <w:pPr>
+              <w:rPr>
+                <w:rFonts w:eastAsia="Times New Roman" w:cs="Times New Roman"/>
+                <w:szCs w:val="24"/>
+              </w:rPr>
+            </w:pPr>
+          </w:p>
+        </w:tc>
+        <w:tc>
+          <w:tcPr>
+            <w:tcW w:w="0" w:type="auto"/>
+            <w:hideMark/>
+          </w:tcPr>
+          <w:p>
+            <w:pPr>
+              <w:rPr>
+                <w:rFonts w:eastAsia="Times New Roman" w:cs="Times New Roman"/>
+                <w:szCs w:val="24"/>
+              </w:rPr>
+            </w:pPr>
+          </w:p>
+        </w:tc>
+        <w:tc>
+          <w:tcPr>
+            <w:tcW w:w="0" w:type="auto"/>
+            <w:hideMark/>
+          </w:tcPr>
+          <w:p>
+            <w:pPr>
+              <w:rPr>
+                <w:rFonts w:eastAsia="Times New Roman" w:cs="Times New Roman"/>
+                <w:szCs w:val="24"/>
+              </w:rPr>
+            </w:pPr>
+          </w:p>
+        </w:tc>
+        <w:tc>
+          <w:tcPr>
+            <w:tcW w:w="0" w:type="auto"/>
+            <w:hideMark/>
+          </w:tcPr>
+          <w:p>
+            <w:pPr>
+              <w:rPr>
+                <w:rFonts w:eastAsia="Times New Roman" w:cs="Times New Roman"/>
+                <w:szCs w:val="24"/>
+              </w:rPr>
+            </w:pPr>
+          </w:p>
+        </w:tc>
+      </w:tr>
     </w:tbl>
-    <w:p>
-      <w:pPr>
-        <w:jc w:val="center"/>
-        <w:rPr>
-          <w:rFonts w:cs="Times New Roman"/>
-          <w:b/>
-          <w:szCs w:val="24"/>
-        </w:rPr>
-      </w:pPr>
-    </w:p>
     <w:p>
       <w:pPr>
         <w:jc w:val="center"/>
@@ -3233,7 +3281,16 @@
           <w:b/>
           <w:szCs w:val="24"/>
         </w:rPr>
-        <w:t>Table 4.</w:t>
+        <w:lastRenderedPageBreak/>
+        <w:t xml:space="preserve">Table </w:t>
+      </w:r>
+      <w:r>
+        <w:rPr>
+          <w:rFonts w:cs="Times New Roman"/>
+          <w:b/>
+          <w:szCs w:val="24"/>
+        </w:rPr>
+        <w:t>.</w:t>
       </w:r>
       <w:proofErr w:type="gramEnd"/>
       <w:r>
@@ -3242,21 +3299,539 @@
           <w:b/>
           <w:szCs w:val="24"/>
         </w:rPr>
+        <w:t xml:space="preserve"> Showing zonal characteristics</w:t>
+      </w:r>
+    </w:p>
+    <w:p>
+      <w:pPr>
+        <w:rPr>
+          <w:b/>
+          <w:szCs w:val="24"/>
+        </w:rPr>
+      </w:pPr>
+      <w:r>
+        <w:rPr>
+          <w:b/>
+          <w:szCs w:val="24"/>
+        </w:rPr>
         <w:t xml:space="preserve"> </w:t>
       </w:r>
       <w:r>
         <w:rPr>
-          <w:rFonts w:cs="Times New Roman"/>
           <w:b/>
           <w:szCs w:val="24"/>
         </w:rPr>
-        <w:t>Showing zonal characteristics</w:t>
+        <w:t>NDVI–LST Correlation Analysis</w:t>
+      </w:r>
+    </w:p>
+    <w:p>
+      <w:pPr>
+        <w:pStyle w:val="NormalWeb"/>
+        <w:rPr>
+          <w:sz w:val="22"/>
+          <w:szCs w:val="22"/>
+        </w:rPr>
+      </w:pPr>
+      <w:r>
+        <w:rPr>
+          <w:sz w:val="22"/>
+          <w:szCs w:val="22"/>
+        </w:rPr>
+        <w:t>To statistically evaluate the relationship between vegetation cover and surface temperature, Pea</w:t>
+      </w:r>
+      <w:r>
+        <w:rPr>
+          <w:sz w:val="22"/>
+          <w:szCs w:val="22"/>
+        </w:rPr>
+        <w:t>r</w:t>
+      </w:r>
+      <w:r>
+        <w:rPr>
+          <w:sz w:val="22"/>
+          <w:szCs w:val="22"/>
+        </w:rPr>
+        <w:t>son’s correlation analysis was conducted between NDVI and Land Surface Temperature (LST) for 2015 and 2025.</w:t>
+      </w:r>
+    </w:p>
+    <w:p>
+      <w:pPr>
+        <w:pStyle w:val="NormalWeb"/>
+        <w:rPr>
+          <w:sz w:val="22"/>
+          <w:szCs w:val="22"/>
+        </w:rPr>
+      </w:pPr>
+      <w:r>
+        <w:rPr>
+          <w:sz w:val="22"/>
+          <w:szCs w:val="22"/>
+        </w:rPr>
+        <w:t>The results indicate a moderate negative correlation in both years:</w:t>
+      </w:r>
+    </w:p>
+    <w:p>
+      <w:pPr>
+        <w:pStyle w:val="NormalWeb"/>
+        <w:numPr>
+          <w:ilvl w:val="0"/>
+          <w:numId w:val="10"/>
+        </w:numPr>
+        <w:rPr>
+          <w:sz w:val="22"/>
+          <w:szCs w:val="22"/>
+        </w:rPr>
+      </w:pPr>
+      <w:r>
+        <w:rPr>
+          <w:sz w:val="22"/>
+          <w:szCs w:val="22"/>
+        </w:rPr>
+        <w:t>2015: r = -0.358</w:t>
+      </w:r>
+    </w:p>
+    <w:p>
+      <w:pPr>
+        <w:pStyle w:val="NormalWeb"/>
+        <w:numPr>
+          <w:ilvl w:val="0"/>
+          <w:numId w:val="10"/>
+        </w:numPr>
+        <w:rPr>
+          <w:sz w:val="22"/>
+          <w:szCs w:val="22"/>
+        </w:rPr>
+      </w:pPr>
+      <w:r>
+        <w:rPr>
+          <w:sz w:val="22"/>
+          <w:szCs w:val="22"/>
+        </w:rPr>
+        <w:t>2025: r = -0.338</w:t>
+      </w:r>
+    </w:p>
+    <w:p>
+      <w:pPr>
+        <w:pStyle w:val="NormalWeb"/>
+        <w:rPr>
+          <w:sz w:val="22"/>
+          <w:szCs w:val="22"/>
+        </w:rPr>
+      </w:pPr>
+      <w:r>
+        <w:rPr>
+          <w:sz w:val="22"/>
+          <w:szCs w:val="22"/>
+        </w:rPr>
+        <w:t>The negative correlation confirms that areas with higher vegetation density experienced lower surface temperatures, demonstrating the cooling effect of urban greenery.</w:t>
+      </w:r>
+    </w:p>
+    <w:p>
+      <w:pPr>
+        <w:pStyle w:val="NormalWeb"/>
+        <w:rPr>
+          <w:sz w:val="22"/>
+          <w:szCs w:val="22"/>
+        </w:rPr>
+      </w:pPr>
+      <w:r>
+        <w:rPr>
+          <w:sz w:val="22"/>
+          <w:szCs w:val="22"/>
+        </w:rPr>
+        <w:t>However, a slight reduction in correlation strength in 2025 suggests increasing urban surface h</w:t>
+      </w:r>
+      <w:r>
+        <w:rPr>
+          <w:sz w:val="22"/>
+          <w:szCs w:val="22"/>
+        </w:rPr>
+        <w:t>e</w:t>
+      </w:r>
+      <w:r>
+        <w:rPr>
+          <w:sz w:val="22"/>
+          <w:szCs w:val="22"/>
+        </w:rPr>
+        <w:t>terogeneity and possible fragmentation of vegetated areas. This indicates that while vegetation continues to mitigate thermal intensity, its effectiveness may be dim</w:t>
+      </w:r>
+      <w:r>
+        <w:rPr>
+          <w:sz w:val="22"/>
+          <w:szCs w:val="22"/>
+        </w:rPr>
+        <w:t>i</w:t>
+      </w:r>
+      <w:r>
+        <w:rPr>
+          <w:sz w:val="22"/>
+          <w:szCs w:val="22"/>
+        </w:rPr>
+        <w:t>nishing due to expanding impervious surfaces.</w:t>
+      </w:r>
+    </w:p>
+    <w:p>
+      <w:pPr>
+        <w:pStyle w:val="NormalWeb"/>
+        <w:rPr>
+          <w:sz w:val="22"/>
+          <w:szCs w:val="22"/>
+        </w:rPr>
+      </w:pPr>
+      <w:r>
+        <w:rPr>
+          <w:sz w:val="22"/>
+          <w:szCs w:val="22"/>
+        </w:rPr>
+        <w:t>These findings statistically validate the observed spatial patterns of Urban Heat Island expansion across Kolkata</w:t>
       </w:r>
     </w:p>
     <w:tbl>
       <w:tblPr>
         <w:tblStyle w:val="TableGrid"/>
-        <w:tblpPr w:leftFromText="180" w:rightFromText="180" w:vertAnchor="text" w:horzAnchor="margin" w:tblpY="68"/>
+        <w:tblW w:w="0" w:type="auto"/>
+        <w:tblLook w:val="04A0"/>
+      </w:tblPr>
+      <w:tblGrid>
+        <w:gridCol w:w="681"/>
+        <w:gridCol w:w="2697"/>
+        <w:gridCol w:w="2276"/>
+        <w:gridCol w:w="3131"/>
+      </w:tblGrid>
+      <w:tr>
+        <w:tc>
+          <w:tcPr>
+            <w:tcW w:w="0" w:type="auto"/>
+            <w:hideMark/>
+          </w:tcPr>
+          <w:p>
+            <w:pPr>
+              <w:jc w:val="center"/>
+              <w:rPr>
+                <w:rFonts w:eastAsia="Times New Roman" w:cs="Times New Roman"/>
+                <w:b/>
+                <w:bCs/>
+                <w:szCs w:val="24"/>
+              </w:rPr>
+            </w:pPr>
+            <w:r>
+              <w:rPr>
+                <w:rFonts w:eastAsia="Times New Roman" w:cs="Times New Roman"/>
+                <w:b/>
+                <w:bCs/>
+                <w:szCs w:val="24"/>
+              </w:rPr>
+              <w:t>Year</w:t>
+            </w:r>
+          </w:p>
+        </w:tc>
+        <w:tc>
+          <w:tcPr>
+            <w:tcW w:w="0" w:type="auto"/>
+            <w:hideMark/>
+          </w:tcPr>
+          <w:p>
+            <w:pPr>
+              <w:jc w:val="center"/>
+              <w:rPr>
+                <w:rFonts w:eastAsia="Times New Roman" w:cs="Times New Roman"/>
+                <w:b/>
+                <w:bCs/>
+                <w:szCs w:val="24"/>
+              </w:rPr>
+            </w:pPr>
+            <w:r>
+              <w:rPr>
+                <w:rFonts w:eastAsia="Times New Roman" w:cs="Times New Roman"/>
+                <w:b/>
+                <w:bCs/>
+                <w:szCs w:val="24"/>
+              </w:rPr>
+              <w:t>Correlation Coefficient (r)</w:t>
+            </w:r>
+          </w:p>
+        </w:tc>
+        <w:tc>
+          <w:tcPr>
+            <w:tcW w:w="0" w:type="auto"/>
+            <w:hideMark/>
+          </w:tcPr>
+          <w:p>
+            <w:pPr>
+              <w:jc w:val="center"/>
+              <w:rPr>
+                <w:rFonts w:eastAsia="Times New Roman" w:cs="Times New Roman"/>
+                <w:b/>
+                <w:bCs/>
+                <w:szCs w:val="24"/>
+              </w:rPr>
+            </w:pPr>
+            <w:r>
+              <w:rPr>
+                <w:rFonts w:eastAsia="Times New Roman" w:cs="Times New Roman"/>
+                <w:b/>
+                <w:bCs/>
+                <w:szCs w:val="24"/>
+              </w:rPr>
+              <w:t>Relationship Strength</w:t>
+            </w:r>
+          </w:p>
+        </w:tc>
+        <w:tc>
+          <w:tcPr>
+            <w:tcW w:w="0" w:type="auto"/>
+            <w:hideMark/>
+          </w:tcPr>
+          <w:p>
+            <w:pPr>
+              <w:jc w:val="center"/>
+              <w:rPr>
+                <w:rFonts w:eastAsia="Times New Roman" w:cs="Times New Roman"/>
+                <w:b/>
+                <w:bCs/>
+                <w:szCs w:val="24"/>
+              </w:rPr>
+            </w:pPr>
+            <w:r>
+              <w:rPr>
+                <w:rFonts w:eastAsia="Times New Roman" w:cs="Times New Roman"/>
+                <w:b/>
+                <w:bCs/>
+                <w:szCs w:val="24"/>
+              </w:rPr>
+              <w:t>Interpretation</w:t>
+            </w:r>
+          </w:p>
+        </w:tc>
+      </w:tr>
+      <w:tr>
+        <w:tc>
+          <w:tcPr>
+            <w:tcW w:w="0" w:type="auto"/>
+            <w:hideMark/>
+          </w:tcPr>
+          <w:p>
+            <w:pPr>
+              <w:rPr>
+                <w:rFonts w:eastAsia="Times New Roman" w:cs="Times New Roman"/>
+                <w:szCs w:val="24"/>
+              </w:rPr>
+            </w:pPr>
+            <w:r>
+              <w:rPr>
+                <w:rFonts w:eastAsia="Times New Roman" w:cs="Times New Roman"/>
+                <w:szCs w:val="24"/>
+              </w:rPr>
+              <w:t>2015</w:t>
+            </w:r>
+          </w:p>
+        </w:tc>
+        <w:tc>
+          <w:tcPr>
+            <w:tcW w:w="0" w:type="auto"/>
+            <w:hideMark/>
+          </w:tcPr>
+          <w:p>
+            <w:pPr>
+              <w:rPr>
+                <w:rFonts w:eastAsia="Times New Roman" w:cs="Times New Roman"/>
+                <w:szCs w:val="24"/>
+              </w:rPr>
+            </w:pPr>
+            <w:r>
+              <w:rPr>
+                <w:rFonts w:eastAsia="Times New Roman" w:cs="Times New Roman"/>
+                <w:szCs w:val="24"/>
+              </w:rPr>
+              <w:t>-0.358</w:t>
+            </w:r>
+          </w:p>
+        </w:tc>
+        <w:tc>
+          <w:tcPr>
+            <w:tcW w:w="0" w:type="auto"/>
+            <w:hideMark/>
+          </w:tcPr>
+          <w:p>
+            <w:pPr>
+              <w:rPr>
+                <w:rFonts w:eastAsia="Times New Roman" w:cs="Times New Roman"/>
+                <w:szCs w:val="24"/>
+              </w:rPr>
+            </w:pPr>
+            <w:r>
+              <w:rPr>
+                <w:rFonts w:eastAsia="Times New Roman" w:cs="Times New Roman"/>
+                <w:szCs w:val="24"/>
+              </w:rPr>
+              <w:t>Moderate Negative</w:t>
+            </w:r>
+          </w:p>
+        </w:tc>
+        <w:tc>
+          <w:tcPr>
+            <w:tcW w:w="0" w:type="auto"/>
+            <w:hideMark/>
+          </w:tcPr>
+          <w:p>
+            <w:pPr>
+              <w:rPr>
+                <w:rFonts w:eastAsia="Times New Roman" w:cs="Times New Roman"/>
+                <w:szCs w:val="24"/>
+              </w:rPr>
+            </w:pPr>
+            <w:r>
+              <w:rPr>
+                <w:rFonts w:eastAsia="Times New Roman" w:cs="Times New Roman"/>
+                <w:szCs w:val="24"/>
+              </w:rPr>
+              <w:t>Vegetation reduces LST</w:t>
+            </w:r>
+          </w:p>
+        </w:tc>
+      </w:tr>
+      <w:tr>
+        <w:tc>
+          <w:tcPr>
+            <w:tcW w:w="0" w:type="auto"/>
+            <w:hideMark/>
+          </w:tcPr>
+          <w:p>
+            <w:pPr>
+              <w:rPr>
+                <w:rFonts w:eastAsia="Times New Roman" w:cs="Times New Roman"/>
+                <w:szCs w:val="24"/>
+              </w:rPr>
+            </w:pPr>
+            <w:r>
+              <w:rPr>
+                <w:rFonts w:eastAsia="Times New Roman" w:cs="Times New Roman"/>
+                <w:szCs w:val="24"/>
+              </w:rPr>
+              <w:t>2025</w:t>
+            </w:r>
+          </w:p>
+        </w:tc>
+        <w:tc>
+          <w:tcPr>
+            <w:tcW w:w="0" w:type="auto"/>
+            <w:hideMark/>
+          </w:tcPr>
+          <w:p>
+            <w:pPr>
+              <w:rPr>
+                <w:rFonts w:eastAsia="Times New Roman" w:cs="Times New Roman"/>
+                <w:szCs w:val="24"/>
+              </w:rPr>
+            </w:pPr>
+            <w:r>
+              <w:rPr>
+                <w:rFonts w:eastAsia="Times New Roman" w:cs="Times New Roman"/>
+                <w:szCs w:val="24"/>
+              </w:rPr>
+              <w:t>-0.338</w:t>
+            </w:r>
+          </w:p>
+        </w:tc>
+        <w:tc>
+          <w:tcPr>
+            <w:tcW w:w="0" w:type="auto"/>
+            <w:hideMark/>
+          </w:tcPr>
+          <w:p>
+            <w:pPr>
+              <w:rPr>
+                <w:rFonts w:eastAsia="Times New Roman" w:cs="Times New Roman"/>
+                <w:szCs w:val="24"/>
+              </w:rPr>
+            </w:pPr>
+            <w:r>
+              <w:rPr>
+                <w:rFonts w:eastAsia="Times New Roman" w:cs="Times New Roman"/>
+                <w:szCs w:val="24"/>
+              </w:rPr>
+              <w:t>Moderate Negative</w:t>
+            </w:r>
+          </w:p>
+        </w:tc>
+        <w:tc>
+          <w:tcPr>
+            <w:tcW w:w="0" w:type="auto"/>
+            <w:hideMark/>
+          </w:tcPr>
+          <w:p>
+            <w:pPr>
+              <w:rPr>
+                <w:rFonts w:eastAsia="Times New Roman" w:cs="Times New Roman"/>
+                <w:szCs w:val="24"/>
+              </w:rPr>
+            </w:pPr>
+            <w:r>
+              <w:rPr>
+                <w:rFonts w:eastAsia="Times New Roman" w:cs="Times New Roman"/>
+                <w:szCs w:val="24"/>
+              </w:rPr>
+              <w:t>Cooling effect slightly we</w:t>
+            </w:r>
+            <w:r>
+              <w:rPr>
+                <w:rFonts w:eastAsia="Times New Roman" w:cs="Times New Roman"/>
+                <w:szCs w:val="24"/>
+              </w:rPr>
+              <w:t>a</w:t>
+            </w:r>
+            <w:r>
+              <w:rPr>
+                <w:rFonts w:eastAsia="Times New Roman" w:cs="Times New Roman"/>
+                <w:szCs w:val="24"/>
+              </w:rPr>
+              <w:t>kened</w:t>
+            </w:r>
+          </w:p>
+        </w:tc>
+      </w:tr>
+    </w:tbl>
+    <w:p>
+      <w:pPr>
+        <w:rPr>
+          <w:rFonts w:cs="Times New Roman"/>
+          <w:szCs w:val="24"/>
+        </w:rPr>
+      </w:pPr>
+    </w:p>
+    <w:p>
+      <w:pPr>
+        <w:rPr>
+          <w:rFonts w:cs="Times New Roman"/>
+          <w:szCs w:val="24"/>
+        </w:rPr>
+      </w:pPr>
+      <w:r>
+        <w:rPr>
+          <w:rFonts w:cs="Times New Roman"/>
+          <w:szCs w:val="24"/>
+        </w:rPr>
+        <w:t>Spatial patterns demonstrate that central commercial and residential regions experienced the greatest temperature increase, attributed to high impervious surface density and l</w:t>
+      </w:r>
+      <w:r>
+        <w:rPr>
+          <w:rFonts w:cs="Times New Roman"/>
+          <w:szCs w:val="24"/>
+        </w:rPr>
+        <w:t>i</w:t>
+      </w:r>
+      <w:r>
+        <w:rPr>
+          <w:rFonts w:cs="Times New Roman"/>
+          <w:szCs w:val="24"/>
+        </w:rPr>
+        <w:t>mited vegetation. Conversely, river-adjacent and wetland zones exhibited cooling trends, reflecting the influence of hydrological and vegetative features.</w:t>
+      </w:r>
+    </w:p>
+    <w:tbl>
+      <w:tblPr>
+        <w:tblStyle w:val="TableGrid"/>
+        <w:tblpPr w:leftFromText="180" w:rightFromText="180" w:vertAnchor="text" w:horzAnchor="margin" w:tblpY="104"/>
         <w:tblW w:w="0" w:type="auto"/>
         <w:tblLook w:val="04A0"/>
       </w:tblPr>
@@ -3665,9 +4240,23 @@
     </w:tbl>
     <w:p>
       <w:pPr>
-        <w:jc w:val="center"/>
+        <w:pStyle w:val="NormalWeb"/>
         <w:rPr>
-          <w:rFonts w:cs="Times New Roman"/>
+          <w:sz w:val="22"/>
+          <w:szCs w:val="22"/>
+        </w:rPr>
+      </w:pPr>
+      <w:r>
+        <w:rPr>
+          <w:sz w:val="22"/>
+          <w:szCs w:val="22"/>
+        </w:rPr>
+        <w:t>.</w:t>
+      </w:r>
+    </w:p>
+    <w:p>
+      <w:pPr>
+        <w:rPr>
           <w:b/>
           <w:szCs w:val="24"/>
         </w:rPr>
@@ -3675,18 +4264,9 @@
     </w:p>
     <w:p>
       <w:pPr>
-        <w:jc w:val="center"/>
         <w:rPr>
           <w:rFonts w:cs="Times New Roman"/>
-          <w:szCs w:val="24"/>
-        </w:rPr>
-      </w:pPr>
-    </w:p>
-    <w:p>
-      <w:pPr>
-        <w:jc w:val="center"/>
-        <w:rPr>
-          <w:rFonts w:cs="Times New Roman"/>
+          <w:b/>
           <w:szCs w:val="24"/>
         </w:rPr>
       </w:pPr>
@@ -3700,6 +4280,7 @@
           <w:szCs w:val="24"/>
         </w:rPr>
       </w:pPr>
+      <w:proofErr w:type="gramStart"/>
       <w:r>
         <w:rPr>
           <w:rFonts w:cs="Times New Roman"/>
@@ -3708,14 +4289,13 @@
         </w:rPr>
         <w:t xml:space="preserve">Table </w:t>
       </w:r>
-      <w:proofErr w:type="gramStart"/>
       <w:r>
         <w:rPr>
           <w:rFonts w:cs="Times New Roman"/>
           <w:b/>
           <w:szCs w:val="24"/>
         </w:rPr>
-        <w:t>5 :</w:t>
+        <w:t xml:space="preserve"> :</w:t>
       </w:r>
       <w:proofErr w:type="gramEnd"/>
       <w:r>
@@ -3724,36 +4304,68 @@
           <w:b/>
           <w:szCs w:val="24"/>
         </w:rPr>
-        <w:t xml:space="preserve"> Showing decadal changes</w:t>
+        <w:t xml:space="preserve"> </w:t>
+      </w:r>
+      <w:r>
+        <w:rPr>
+          <w:b/>
+        </w:rPr>
+        <w:t>Decadal Urban Thermal Risk Indicators (2015–2025)</w:t>
       </w:r>
     </w:p>
     <w:p>
       <w:pPr>
-        <w:rPr>
-          <w:rFonts w:cs="Times New Roman"/>
-          <w:szCs w:val="24"/>
-        </w:rPr>
+        <w:pStyle w:val="NormalWeb"/>
       </w:pPr>
       <w:r>
-        <w:rPr>
-          <w:rFonts w:cs="Times New Roman"/>
-          <w:szCs w:val="24"/>
-        </w:rPr>
-        <w:t>Spatial patterns demonstrate that central commercial and residential regions experienced the greatest temperature increase, attributed to high impervious surface density and l</w:t>
+        <w:t>The results indicate a substantial intensification of surface thermal conditions across Ko</w:t>
       </w:r>
       <w:r>
-        <w:rPr>
-          <w:rFonts w:cs="Times New Roman"/>
-          <w:szCs w:val="24"/>
-        </w:rPr>
+        <w:t>l</w:t>
+      </w:r>
+      <w:r>
+        <w:t>kata between 2015 and 2025. The mean surface temperature increased by 2.57°C, su</w:t>
+      </w:r>
+      <w:r>
+        <w:t>g</w:t>
+      </w:r>
+      <w:r>
+        <w:t>gesting an overall upward shift in the city’s thermal baseline. More critically, the max</w:t>
+      </w:r>
+      <w:r>
         <w:t>i</w:t>
       </w:r>
       <w:r>
-        <w:rPr>
-          <w:rFonts w:cs="Times New Roman"/>
-          <w:szCs w:val="24"/>
-        </w:rPr>
-        <w:t>mited vegetation. Conversely, river-adjacent and wetland zones exhibited cooling trends, reflecting the influence of hydrological and vegetative features.</w:t>
+        <w:t>mum surface temperature rose by 3.77°C, indicating growing exposure to extreme heat conditions.</w:t>
+      </w:r>
+    </w:p>
+    <w:p>
+      <w:pPr>
+        <w:pStyle w:val="NormalWeb"/>
+      </w:pPr>
+      <w:r>
+        <w:lastRenderedPageBreak/>
+        <w:t>The most significant transformation is the 13.7% expansion in areas classified as High and Very High UHI zones. This expansion reflects spatial amplification of thermal hot</w:t>
+      </w:r>
+      <w:r>
+        <w:t>s</w:t>
+      </w:r>
+      <w:r>
+        <w:t>pots, likely associated with accelerated built-up growth and vegetation decline.</w:t>
+      </w:r>
+    </w:p>
+    <w:p>
+      <w:pPr>
+        <w:pStyle w:val="NormalWeb"/>
+      </w:pPr>
+      <w:r>
+        <w:t>Such escalation has implications for public health vulnerability, energy demand, and i</w:t>
+      </w:r>
+      <w:r>
+        <w:t>n</w:t>
+      </w:r>
+      <w:r>
+        <w:t>frastructure stress in high-density urban sectors.</w:t>
       </w:r>
     </w:p>
     <w:p>
@@ -4064,6 +4676,7 @@
       </w:pPr>
       <w:proofErr w:type="spellStart"/>
       <w:r>
+        <w:lastRenderedPageBreak/>
         <w:t>Rasul</w:t>
       </w:r>
       <w:proofErr w:type="spellEnd"/>
@@ -4520,6 +5133,155 @@
       </w:rPr>
     </w:lvl>
   </w:abstractNum>
+  <w:abstractNum w:abstractNumId="9">
+    <w:nsid w:val="25B54FE2"/>
+    <w:multiLevelType w:val="multilevel"/>
+    <w:tmpl w:val="AA1468F2"/>
+    <w:lvl w:ilvl="0">
+      <w:start w:val="1"/>
+      <w:numFmt w:val="bullet"/>
+      <w:lvlText w:val=""/>
+      <w:lvlJc w:val="left"/>
+      <w:pPr>
+        <w:tabs>
+          <w:tab w:val="num" w:pos="720"/>
+        </w:tabs>
+        <w:ind w:left="720" w:hanging="360"/>
+      </w:pPr>
+      <w:rPr>
+        <w:rFonts w:ascii="Symbol" w:hAnsi="Symbol" w:hint="default"/>
+        <w:sz w:val="20"/>
+      </w:rPr>
+    </w:lvl>
+    <w:lvl w:ilvl="1" w:tentative="1">
+      <w:start w:val="1"/>
+      <w:numFmt w:val="bullet"/>
+      <w:lvlText w:val="o"/>
+      <w:lvlJc w:val="left"/>
+      <w:pPr>
+        <w:tabs>
+          <w:tab w:val="num" w:pos="1440"/>
+        </w:tabs>
+        <w:ind w:left="1440" w:hanging="360"/>
+      </w:pPr>
+      <w:rPr>
+        <w:rFonts w:ascii="Courier New" w:hAnsi="Courier New" w:hint="default"/>
+        <w:sz w:val="20"/>
+      </w:rPr>
+    </w:lvl>
+    <w:lvl w:ilvl="2" w:tentative="1">
+      <w:start w:val="1"/>
+      <w:numFmt w:val="bullet"/>
+      <w:lvlText w:val=""/>
+      <w:lvlJc w:val="left"/>
+      <w:pPr>
+        <w:tabs>
+          <w:tab w:val="num" w:pos="2160"/>
+        </w:tabs>
+        <w:ind w:left="2160" w:hanging="360"/>
+      </w:pPr>
+      <w:rPr>
+        <w:rFonts w:ascii="Wingdings" w:hAnsi="Wingdings" w:hint="default"/>
+        <w:sz w:val="20"/>
+      </w:rPr>
+    </w:lvl>
+    <w:lvl w:ilvl="3" w:tentative="1">
+      <w:start w:val="1"/>
+      <w:numFmt w:val="bullet"/>
+      <w:lvlText w:val=""/>
+      <w:lvlJc w:val="left"/>
+      <w:pPr>
+        <w:tabs>
+          <w:tab w:val="num" w:pos="2880"/>
+        </w:tabs>
+        <w:ind w:left="2880" w:hanging="360"/>
+      </w:pPr>
+      <w:rPr>
+        <w:rFonts w:ascii="Wingdings" w:hAnsi="Wingdings" w:hint="default"/>
+        <w:sz w:val="20"/>
+      </w:rPr>
+    </w:lvl>
+    <w:lvl w:ilvl="4" w:tentative="1">
+      <w:start w:val="1"/>
+      <w:numFmt w:val="bullet"/>
+      <w:lvlText w:val=""/>
+      <w:lvlJc w:val="left"/>
+      <w:pPr>
+        <w:tabs>
+          <w:tab w:val="num" w:pos="3600"/>
+        </w:tabs>
+        <w:ind w:left="3600" w:hanging="360"/>
+      </w:pPr>
+      <w:rPr>
+        <w:rFonts w:ascii="Wingdings" w:hAnsi="Wingdings" w:hint="default"/>
+        <w:sz w:val="20"/>
+      </w:rPr>
+    </w:lvl>
+    <w:lvl w:ilvl="5" w:tentative="1">
+      <w:start w:val="1"/>
+      <w:numFmt w:val="bullet"/>
+      <w:lvlText w:val=""/>
+      <w:lvlJc w:val="left"/>
+      <w:pPr>
+        <w:tabs>
+          <w:tab w:val="num" w:pos="4320"/>
+        </w:tabs>
+        <w:ind w:left="4320" w:hanging="360"/>
+      </w:pPr>
+      <w:rPr>
+        <w:rFonts w:ascii="Wingdings" w:hAnsi="Wingdings" w:hint="default"/>
+        <w:sz w:val="20"/>
+      </w:rPr>
+    </w:lvl>
+    <w:lvl w:ilvl="6" w:tentative="1">
+      <w:start w:val="1"/>
+      <w:numFmt w:val="bullet"/>
+      <w:lvlText w:val=""/>
+      <w:lvlJc w:val="left"/>
+      <w:pPr>
+        <w:tabs>
+          <w:tab w:val="num" w:pos="5040"/>
+        </w:tabs>
+        <w:ind w:left="5040" w:hanging="360"/>
+      </w:pPr>
+      <w:rPr>
+        <w:rFonts w:ascii="Wingdings" w:hAnsi="Wingdings" w:hint="default"/>
+        <w:sz w:val="20"/>
+      </w:rPr>
+    </w:lvl>
+    <w:lvl w:ilvl="7" w:tentative="1">
+      <w:start w:val="1"/>
+      <w:numFmt w:val="bullet"/>
+      <w:lvlText w:val=""/>
+      <w:lvlJc w:val="left"/>
+      <w:pPr>
+        <w:tabs>
+          <w:tab w:val="num" w:pos="5760"/>
+        </w:tabs>
+        <w:ind w:left="5760" w:hanging="360"/>
+      </w:pPr>
+      <w:rPr>
+        <w:rFonts w:ascii="Wingdings" w:hAnsi="Wingdings" w:hint="default"/>
+        <w:sz w:val="20"/>
+      </w:rPr>
+    </w:lvl>
+    <w:lvl w:ilvl="8" w:tentative="1">
+      <w:start w:val="1"/>
+      <w:numFmt w:val="bullet"/>
+      <w:lvlText w:val=""/>
+      <w:lvlJc w:val="left"/>
+      <w:pPr>
+        <w:tabs>
+          <w:tab w:val="num" w:pos="6480"/>
+        </w:tabs>
+        <w:ind w:left="6480" w:hanging="360"/>
+      </w:pPr>
+      <w:rPr>
+        <w:rFonts w:ascii="Wingdings" w:hAnsi="Wingdings" w:hint="default"/>
+        <w:sz w:val="20"/>
+      </w:rPr>
+    </w:lvl>
+  </w:abstractNum>
   <w:num w:numId="1">
     <w:abstractNumId w:val="8"/>
   </w:num>
@@ -4546,6 +5308,9 @@
   </w:num>
   <w:num w:numId="9">
     <w:abstractNumId w:val="0"/>
+  </w:num>
+  <w:num w:numId="10">
+    <w:abstractNumId w:val="9"/>
   </w:num>
 </w:numbering>
 </file>
@@ -28584,7 +29349,7 @@
 </file>
 
 <file path=customXml/itemProps1.xml><?xml version="1.0" encoding="utf-8"?>
-<ds:datastoreItem xmlns:ds="http://schemas.openxmlformats.org/officeDocument/2006/customXml" ds:itemID="{D965EED4-5676-4007-8EE2-E88A602F7D06}">
+<ds:datastoreItem xmlns:ds="http://schemas.openxmlformats.org/officeDocument/2006/customXml" ds:itemID="{7BB8B4F5-E9FD-4E86-B9C4-2B2EDD3CDF3D}">
   <ds:schemaRefs>
     <ds:schemaRef ds:uri="http://schemas.openxmlformats.org/officeDocument/2006/bibliography"/>
   </ds:schemaRefs>

</xml_diff>